<commit_message>
Refine English TOC terminology
Agent-Logs-Url: https://github.com/wkybill/55/sessions/add4927d-31a2-4886-a92b-bc7b0e0e3871

Co-authored-by: wkybill <151885169+wkybill@users.noreply.github.com>
</commit_message>
<xml_diff>
--- a/英文目录.docx
+++ b/英文目录.docx
@@ -82,7 +82,7 @@
           <w:b/>
           <w:sz w:val="24"/>
         </w:rPr>
-        <w:t>1.2 Domestic and International Research Progress</w:t>
+        <w:t>1.2 Research Progress at Home and Abroad</w:t>
       </w:r>
       <w:r>
         <w:rPr>
@@ -134,7 +134,7 @@
           <w:b/>
           <w:sz w:val="24"/>
         </w:rPr>
-        <w:t>2.1 Earth System Model Large Ensemble</w:t>
+        <w:t>2.1 CESM2 Large Ensemble Simulations</w:t>
       </w:r>
       <w:r>
         <w:rPr>
@@ -212,7 +212,7 @@
           <w:b/>
           <w:sz w:val="24"/>
         </w:rPr>
-        <w:t>3.1 Characteristics of Climate Change Signals in Environmental Variables</w:t>
+        <w:t>3.1 Climate Change Signals in Marine Environmental Variables</w:t>
       </w:r>
       <w:r>
         <w:rPr>
@@ -316,7 +316,7 @@
           <w:b/>
           <w:sz w:val="24"/>
         </w:rPr>
-        <w:t>4.1 ToE Analysis of Environmental Variables</w:t>
+        <w:t>4.1 Time of Emergence Analysis for Marine Environmental Variables</w:t>
       </w:r>
       <w:r>
         <w:rPr>
@@ -342,7 +342,7 @@
           <w:b/>
           <w:sz w:val="24"/>
         </w:rPr>
-        <w:t>4.2 ToE Analysis of Lower-Trophic-Level Variables</w:t>
+        <w:t>4.2 Time of Emergence Analysis for Lower-Trophic-Level Variables</w:t>
       </w:r>
       <w:r>
         <w:rPr>
@@ -368,7 +368,7 @@
           <w:b/>
           <w:sz w:val="24"/>
         </w:rPr>
-        <w:t>4.3 ToE and Characteristics of Fish Functional Group Biomass</w:t>
+        <w:t>4.3 Time of Emergence and Characteristics of Fish Functional Group Biomass</w:t>
       </w:r>
       <w:r>
         <w:rPr>

</xml_diff>